<commit_message>
docs: slim P0 checklist to remaining 1.0 blockers
Remove completed 0.6.0, sample proof, and CI items from the P0 doc.
Ten items remain across testing, distribution, platform, and release sign-off.
</commit_message>
<xml_diff>
--- a/docs/SyncForge-1.0-P0.docx
+++ b/docs/SyncForge-1.0-P0.docx
@@ -35,117 +35,9 @@
         <w:t>Current baseline: 0.6.0-SNAPSHOT</w:t>
       </w:r>
     </w:p>
-    <w:p/>
     <w:p>
-      <w:pPr>
-        <w:pStyle w:val="Heading1"/>
-      </w:pPr>
       <w:r>
-        <w:t>Completed in 0.6.0</w:t>
-      </w:r>
-    </w:p>
-    <w:p>
-      <w:pPr>
-        <w:pStyle w:val="ListBullet"/>
-      </w:pPr>
-      <w:r>
-        <w:t>SQLDelight Android default + automatic RoomToSqlDelightMigrator</w:t>
-      </w:r>
-    </w:p>
-    <w:p>
-      <w:pPr>
-        <w:pStyle w:val="ListBullet"/>
-      </w:pPr>
-      <w:r>
-        <w:t>Legacy Room internals removed from public API (useRoomPersistence() opt-in retained)</w:t>
-      </w:r>
-    </w:p>
-    <w:p>
-      <w:pPr>
-        <w:pStyle w:val="ListBullet"/>
-      </w:pPr>
-      <w:r>
-        <w:t>Docs synced: README, ROADMAP, KMP_MIGRATION, GETTING_STARTED, MODULES, ANDROID_SETUP</w:t>
-      </w:r>
-    </w:p>
-    <w:p>
-      <w:pPr>
-        <w:pStyle w:val="ListBullet"/>
-      </w:pPr>
-      <w:r>
-        <w:t>Pre-0.6 Room upgrade path documented in ANDROID_SETUP.md</w:t>
-      </w:r>
-    </w:p>
-    <w:p>
-      <w:pPr>
-        <w:pStyle w:val="Heading1"/>
-      </w:pPr>
-      <w:r>
-        <w:t>Completed in :sample (multi-entity proof)</w:t>
-      </w:r>
-    </w:p>
-    <w:p>
-      <w:pPr>
-        <w:pStyle w:val="ListBullet"/>
-      </w:pPr>
-      <w:r>
-        <w:t>Three entities (tasks, notes, tags) with Room DAOs and KSP handlers (:sample)</w:t>
-      </w:r>
-    </w:p>
-    <w:p>
-      <w:pPr>
-        <w:pStyle w:val="ListBullet"/>
-      </w:pPr>
-      <w:r>
-        <w:t>Compose Navigation: TasksRoute, NotesRoute, TagsRoute in SampleApp.kt</w:t>
-      </w:r>
-    </w:p>
-    <w:p>
-      <w:pPr>
-        <w:pStyle w:val="ListBullet"/>
-      </w:pPr>
-      <w:r>
-        <w:t>Single SyncManager + multi-handler EntityRegistry (SyncForgeHandlers.registry)</w:t>
-      </w:r>
-    </w:p>
-    <w:p>
-      <w:pPr>
-        <w:pStyle w:val="ListBullet"/>
-      </w:pPr>
-      <w:r>
-        <w:t>Per-entity conflict policies: tasks deferToUser(), notes/tags lastWriteWins()</w:t>
-      </w:r>
-    </w:p>
-    <w:p>
-      <w:pPr>
-        <w:pStyle w:val="ListBullet"/>
-      </w:pPr>
-      <w:r>
-        <w:t>Acceptance: add task + note on separate screens; one sync() pushes both types</w:t>
-      </w:r>
-    </w:p>
-    <w:p>
-      <w:pPr>
-        <w:pStyle w:val="ListBullet"/>
-      </w:pPr>
-      <w:r>
-        <w:t>Acceptance: task conflict does not block notes sync; debug panel lists both entity types</w:t>
-      </w:r>
-    </w:p>
-    <w:p>
-      <w:pPr>
-        <w:pStyle w:val="Heading1"/>
-      </w:pPr>
-      <w:r>
-        <w:t>Completed — CI &amp; release</w:t>
-      </w:r>
-    </w:p>
-    <w:p>
-      <w:pPr>
-        <w:pStyle w:val="ListBullet"/>
-      </w:pPr>
-      <w:r>
-        <w:t>macOS release workflow publishes iOS/macOS frameworks on tag (.github/workflows/publish-release.yml)</w:t>
+        <w:t>Remaining P0 items: 10</w:t>
       </w:r>
     </w:p>
     <w:p/>
@@ -159,7 +51,7 @@
     </w:p>
     <w:p>
       <w:r>
-        <w:t>Tag 1.0.0 only when every item below is complete and verified. The Sample App Proof demonstrates multiple entities, DAOs, and navigation routes on one SyncManager instance.</w:t>
+        <w:t>Tag 1.0.0 only when every item below is complete and verified. The :sample app already proves multi-entity sync on a single SyncManager; automation, distribution, and platform gaps below are what remain.</w:t>
       </w:r>
     </w:p>
     <w:p>
@@ -167,7 +59,7 @@
         <w:pStyle w:val="Heading2"/>
       </w:pPr>
       <w:r>
-        <w:t>Sample App Proof (0.8.0)</w:t>
+        <w:t>Testing (0.8.0)</w:t>
       </w:r>
     </w:p>
     <w:p>
@@ -175,7 +67,15 @@
         <w:pStyle w:val="ListBullet"/>
       </w:pPr>
       <w:r>
-        <w:t>E2E tests for multi-entity flows (task + note)</w:t>
+        <w:t>Multi-entity E2E tests (task + note flows)</w:t>
+      </w:r>
+    </w:p>
+    <w:p>
+      <w:pPr>
+        <w:pStyle w:val="ListBullet"/>
+      </w:pPr>
+      <w:r>
+        <w:t>Wire androidE2e into main CI (emulator + mock-server)</w:t>
       </w:r>
     </w:p>
     <w:p>
@@ -191,7 +91,7 @@
         <w:pStyle w:val="ListBullet"/>
       </w:pPr>
       <w:r>
-        <w:t>Migrator hardening: partial failure, logging, large outbox tests</w:t>
+        <w:t>Migrator hardening: partial failure recovery, logging, large outbox tests</w:t>
       </w:r>
     </w:p>
     <w:p>
@@ -199,7 +99,7 @@
         <w:pStyle w:val="Heading2"/>
       </w:pPr>
       <w:r>
-        <w:t>Documentation &amp; distribution (0.6.0–0.9.0)</w:t>
+        <w:t>Documentation &amp; distribution (0.9.0)</w:t>
       </w:r>
     </w:p>
     <w:p>
@@ -207,7 +107,7 @@
         <w:pStyle w:val="ListBullet"/>
       </w:pPr>
       <w:r>
-        <w:t>Publish 0.6.0+ to Maven Central with verified consumer Gradle snippet</w:t>
+        <w:t>First public Maven Central release with verified consumer Gradle snippet</w:t>
       </w:r>
     </w:p>
     <w:p>
@@ -223,7 +123,7 @@
         <w:pStyle w:val="ListBullet"/>
       </w:pPr>
       <w:r>
-        <w:t>Minimum Ktor reference backend starter (beyond mock-server)</w:t>
+        <w:t>Minimum Ktor reference backend starter (beyond :mock-server)</w:t>
       </w:r>
     </w:p>
     <w:p>
@@ -255,7 +155,7 @@
         <w:pStyle w:val="Heading2"/>
       </w:pPr>
       <w:r>
-        <w:t>API stability (0.8.0–1.0.0)</w:t>
+        <w:t>API cleanup (1.0.0)</w:t>
       </w:r>
     </w:p>
     <w:p>
@@ -263,15 +163,7 @@
         <w:pStyle w:val="ListBullet"/>
       </w:pPr>
       <w:r>
-        <w:t>Graduate SyncForge.android and core SyncManager APIs as stable</w:t>
-      </w:r>
-    </w:p>
-    <w:p>
-      <w:pPr>
-        <w:pStyle w:val="ListBullet"/>
-      </w:pPr>
-      <w:r>
-        <w:t>Remove ConflictResolver, LastWriteWinsResolver, fromResolver at 1.0</w:t>
+        <w:t>Remove ConflictResolver, LastWriteWinsResolver, and fromResolver()</w:t>
       </w:r>
     </w:p>
     <w:p>
@@ -279,15 +171,7 @@
         <w:pStyle w:val="Heading2"/>
       </w:pPr>
       <w:r>
-        <w:t>CI &amp; release (0.7.0–1.0.0)</w:t>
-      </w:r>
-    </w:p>
-    <w:p>
-      <w:pPr>
-        <w:pStyle w:val="ListBullet"/>
-      </w:pPr>
-      <w:r>
-        <w:t>Add androidE2e to nightly or main CI (emulator + mock-server)</w:t>
+        <w:t>Release sign-off (1.0.0)</w:t>
       </w:r>
     </w:p>
     <w:p>

</xml_diff>

<commit_message>
Add multi-entity E2E tests and CI android-e2e job
Extract shared UiAutomator helpers into SampleE2ETestBase, add
MultiEntityE2ETest for task+note sync and conflict isolation, fix
launch detection for the tabbed SampleApp shell, and run
scripts/run-android-e2e.sh on an API 29 emulator in CI.
</commit_message>
<xml_diff>
--- a/docs/SyncForge-1.0-P0.docx
+++ b/docs/SyncForge-1.0-P0.docx
@@ -37,7 +37,7 @@
     </w:p>
     <w:p>
       <w:r>
-        <w:t>Remaining P0 items: 10</w:t>
+        <w:t>Remaining P0 items: 8</w:t>
       </w:r>
     </w:p>
     <w:p/>
@@ -52,30 +52,6 @@
     <w:p>
       <w:r>
         <w:t>Tag 1.0.0 only when every item below is complete and verified. The :sample app already proves multi-entity sync on a single SyncManager; automation, distribution, and platform gaps below are what remain.</w:t>
-      </w:r>
-    </w:p>
-    <w:p>
-      <w:pPr>
-        <w:pStyle w:val="Heading2"/>
-      </w:pPr>
-      <w:r>
-        <w:t>Testing (0.8.0)</w:t>
-      </w:r>
-    </w:p>
-    <w:p>
-      <w:pPr>
-        <w:pStyle w:val="ListBullet"/>
-      </w:pPr>
-      <w:r>
-        <w:t>Multi-entity E2E tests (task + note flows)</w:t>
-      </w:r>
-    </w:p>
-    <w:p>
-      <w:pPr>
-        <w:pStyle w:val="ListBullet"/>
-      </w:pPr>
-      <w:r>
-        <w:t>Wire androidE2e into main CI (emulator + mock-server)</w:t>
       </w:r>
     </w:p>
     <w:p>

</xml_diff>

<commit_message>
Complete 1.0 docs freeze (P0-06)
Align CHANGELOG, MODULES, and GETTING_STARTED with stable 1.0 API
boundaries; mark P0-06 and P1-04 done in roadmaps and refresh P0 docx.
</commit_message>
<xml_diff>
--- a/docs/SyncForge-1.0-P0.docx
+++ b/docs/SyncForge-1.0-P0.docx
@@ -28,7 +28,7 @@
     </w:p>
     <w:p>
       <w:r>
-        <w:t>Remaining work items: 6</w:t>
+        <w:t>Remaining work items: 5</w:t>
       </w:r>
     </w:p>
     <w:p>
@@ -71,7 +71,7 @@
         <w:pStyle w:val="Heading2"/>
       </w:pPr>
       <w:r>
-        <w:t>Documentation (1.0-P0-06)</w:t>
+        <w:t>Documentation (P1-01)</w:t>
       </w:r>
     </w:p>
     <w:p>
@@ -79,15 +79,7 @@
         <w:pStyle w:val="ListBullet"/>
       </w:pPr>
       <w:r>
-        <w:t>Docs freeze — CHANGELOG, MODULES, GETTING_STARTED match 1.0 APIs exactly</w:t>
-      </w:r>
-    </w:p>
-    <w:p>
-      <w:pPr>
-        <w:pStyle w:val="ListBullet"/>
-      </w:pPr>
-      <w:r>
-        <w:t>Upgrade guide — pre-0.6 Room → SQLDelight (P1-01, recommended)</w:t>
+        <w:t>Upgrade guide — pre-0.6 Room → SQLDelight (recommended; migration path in ANDROID_SETUP.md)</w:t>
       </w:r>
     </w:p>
     <w:p>

</xml_diff>

<commit_message>
Complete 1.0 sign-off matrix soak (P0-04)
Add verifySignOffMatrix task and run-sign-off-matrix.sh; document
checklist status in ROADMAP_1_0_TO_2_0. CI run #102 all green on
0.9.0-rc.5 — re-verify at v1.0.0 tag for publish rows.
</commit_message>
<xml_diff>
--- a/docs/SyncForge-1.0-P0.docx
+++ b/docs/SyncForge-1.0-P0.docx
@@ -28,12 +28,12 @@
     </w:p>
     <w:p>
       <w:r>
-        <w:t>Remaining work items: 5</w:t>
+        <w:t>Remaining work items: 8</w:t>
       </w:r>
     </w:p>
     <w:p>
       <w:r>
-        <w:t>Release sign-off checks: 5</w:t>
+        <w:t>Release sign-off checks: 0</w:t>
       </w:r>
     </w:p>
     <w:p/>
@@ -127,7 +127,7 @@
         <w:pStyle w:val="Heading2"/>
       </w:pPr>
       <w:r>
-        <w:t>Release sign-off gate (1.0-P0-04)</w:t>
+        <w:t>Release gate (post-soak)</w:t>
       </w:r>
     </w:p>
     <w:p>
@@ -135,7 +135,7 @@
         <w:pStyle w:val="ListBullet"/>
       </w:pPr>
       <w:r>
-        <w:t>All work items above complete and verified</w:t>
+        <w:t>Re-run sign-off matrix at v1.0.0 — ./gradlew verifySignOffMatrix + CI E2E + publish-release.yml on tag</w:t>
       </w:r>
     </w:p>
     <w:p>
@@ -143,23 +143,7 @@
         <w:pStyle w:val="ListBullet"/>
       </w:pPr>
       <w:r>
-        <w:t>Full 1.0 sign-off matrix passed — see docs/ROADMAP_1_0_TO_2_0.md § 1.0.0 sign-off</w:t>
-      </w:r>
-    </w:p>
-    <w:p>
-      <w:pPr>
-        <w:pStyle w:val="ListBullet"/>
-      </w:pPr>
-      <w:r>
-        <w:t>CI green: verifyReleaseSignOff + androidE2e + iosE2e + verifyConsumerSmokeMavenCentral</w:t>
-      </w:r>
-    </w:p>
-    <w:p>
-      <w:pPr>
-        <w:pStyle w:val="ListBullet"/>
-      </w:pPr>
-      <w:r>
-        <w:t>Integration tests (P1-04): SyncEngineIntegrationTest — retry exhaustion, multi-page pull, offline queue</w:t>
+        <w:t>Bump consumer-smoke Maven Central pins to 1.0.0 after Central sync</w:t>
       </w:r>
     </w:p>
     <w:p>

</xml_diff>

<commit_message>
Add 1.1.0 GitHub issues breakdown to roadmap and docx exports
Document six epics (network, store, auth, DI, cursor, release) with
issue titles, dependencies, and a six-week implementation order.
Add generate-1.1-docx.py and refresh roadmap/P0 Word exports.
</commit_message>
<xml_diff>
--- a/docs/SyncForge-1.0-P0.docx
+++ b/docs/SyncForge-1.0-P0.docx
@@ -13,7 +13,7 @@
     </w:p>
     <w:p>
       <w:r>
-        <w:t>Remaining work before first stable release (1.0.0).</w:t>
+        <w:t>Post-1.0.0 follow-ups (P1 / community; P0 release gate complete).</w:t>
       </w:r>
     </w:p>
     <w:p>
@@ -23,12 +23,12 @@
     </w:p>
     <w:p>
       <w:r>
-        <w:t>Current baseline: 0.9.0-rc.5 (Maven Central complete)</w:t>
+        <w:t>Current baseline: 1.0.0 (Maven Central stable release)</w:t>
       </w:r>
     </w:p>
     <w:p>
       <w:r>
-        <w:t>Remaining work items: 8</w:t>
+        <w:t>Remaining work items: 3</w:t>
       </w:r>
     </w:p>
     <w:p>
@@ -42,28 +42,12 @@
         <w:pStyle w:val="Heading1"/>
       </w:pPr>
       <w:r>
-        <w:t>Release gate</w:t>
+        <w:t>1.0.0 status</w:t>
       </w:r>
     </w:p>
     <w:p>
       <w:r>
-        <w:t>Tag 1.0.0 only when every work item below is complete and every sign-off check passes. Maven publish: docs/MAVEN_PUBLISH.md.</w:t>
-      </w:r>
-    </w:p>
-    <w:p>
-      <w:pPr>
-        <w:pStyle w:val="Heading2"/>
-      </w:pPr>
-      <w:r>
-        <w:t>Distribution (1.0-P0-03)</w:t>
-      </w:r>
-    </w:p>
-    <w:p>
-      <w:pPr>
-        <w:pStyle w:val="ListBullet"/>
-      </w:pPr>
-      <w:r>
-        <w:t>Publish 1.0.0 to Maven Central — tag v1.0.0; all artifacts (syncforge, annotations, ksp, persistence, android-deps, bom, gradle-plugin)</w:t>
+        <w:t>GA on Maven Central (studio.syncforge:1.0.0) with tag v1.0.0. Items below are P1/community follow-ups, not release blockers.</w:t>
       </w:r>
     </w:p>
     <w:p>
@@ -87,15 +71,7 @@
         <w:pStyle w:val="Heading2"/>
       </w:pPr>
       <w:r>
-        <w:t>CI &amp; QA (1.0-P0-05, P1-03)</w:t>
-      </w:r>
-    </w:p>
-    <w:p>
-      <w:pPr>
-        <w:pStyle w:val="ListBullet"/>
-      </w:pPr>
-      <w:r>
-        <w:t>macOS tag publish — iOS/macOS frameworks from publish-release.yml without manual steps</w:t>
+        <w:t>CI &amp; QA (P1-03)</w:t>
       </w:r>
     </w:p>
     <w:p>
@@ -120,38 +96,6 @@
       </w:pPr>
       <w:r>
         <w:t>At least one external dogfood or documented third-party integration (#feed thread, GitHub issues)</w:t>
-      </w:r>
-    </w:p>
-    <w:p>
-      <w:pPr>
-        <w:pStyle w:val="Heading2"/>
-      </w:pPr>
-      <w:r>
-        <w:t>Release gate (post-soak)</w:t>
-      </w:r>
-    </w:p>
-    <w:p>
-      <w:pPr>
-        <w:pStyle w:val="ListBullet"/>
-      </w:pPr>
-      <w:r>
-        <w:t>Re-run sign-off matrix at v1.0.0 — ./gradlew verifySignOffMatrix + CI E2E + publish-release.yml on tag</w:t>
-      </w:r>
-    </w:p>
-    <w:p>
-      <w:pPr>
-        <w:pStyle w:val="ListBullet"/>
-      </w:pPr>
-      <w:r>
-        <w:t>Bump consumer-smoke Maven Central pins to 1.0.0 after Central sync</w:t>
-      </w:r>
-    </w:p>
-    <w:p>
-      <w:pPr>
-        <w:pStyle w:val="ListBullet"/>
-      </w:pPr>
-      <w:r>
-        <w:t>Tag v1.0.0</w:t>
       </w:r>
     </w:p>
     <w:sectPr>

</xml_diff>